<commit_message>
Update scenario after incorrect prompt
</commit_message>
<xml_diff>
--- a/evaluation/responses/exports/scenario-1-prompt-a-baseline.docx
+++ b/evaluation/responses/exports/scenario-1-prompt-a-baseline.docx
@@ -111,7 +111,7 @@
         <w:rPr>
           <w:rStyle w:val="VerbatimChar"/>
         </w:rPr>
-        <w:t xml:space="preserve">You are a reputation management consultant. A UK debt collection company has approached you with the following problem:</w:t>
+        <w:t xml:space="preserve">You are a senior reputation management consultant. A client has come to you with the following situation:</w:t>
       </w:r>
       <w:r>
         <w:br/>
@@ -123,7 +123,10 @@
         <w:rPr>
           <w:rStyle w:val="VerbatimChar"/>
         </w:rPr>
-        <w:t xml:space="preserve">When their company name is Googled, 8 of the top 20 results on Google Pages 1-2 are negative. The negative results include:</w:t>
+        <w:t xml:space="preserve">She is a former CFO of a UK retail company who was involved in an employment tribunal 3 years ago. National newspapers (The Guardian, Daily Mail, BBC) covered the case extensively. When her name is Googled, 9 out of 10 results on Page 1 are negative articles about the tribunal. Google Images is dominated by court attendance photos from press libraries like Alamy and Shutterstock. She wants to pursue Non-Executive Director roles but boards are seeing only the tribunal coverage when they search her name.</w:t>
+      </w:r>
+      <w:r>
+        <w:br/>
       </w:r>
       <w:r>
         <w:br/>
@@ -132,7 +135,10 @@
         <w:rPr>
           <w:rStyle w:val="VerbatimChar"/>
         </w:rPr>
-        <w:t xml:space="preserve">- Two threads on Money Saving Expert forums calling the company a "scam"</w:t>
+        <w:t xml:space="preserve">She is UK-based and all the articles are on UK news sites.</w:t>
+      </w:r>
+      <w:r>
+        <w:br/>
       </w:r>
       <w:r>
         <w:br/>
@@ -141,7 +147,7 @@
         <w:rPr>
           <w:rStyle w:val="VerbatimChar"/>
         </w:rPr>
-        <w:t xml:space="preserve">- A long thread on Consumer Action Group alleging illegal debt collection practices</w:t>
+        <w:t xml:space="preserve">Please provide:</w:t>
       </w:r>
       <w:r>
         <w:br/>
@@ -150,7 +156,7 @@
         <w:rPr>
           <w:rStyle w:val="VerbatimChar"/>
         </w:rPr>
-        <w:t xml:space="preserve">- Multiple 1-star Trustpilot reviews</w:t>
+        <w:t xml:space="preserve">1. A detailed strategy for transforming her search results, covering both content removal and positive content creation</w:t>
       </w:r>
       <w:r>
         <w:br/>
@@ -159,7 +165,7 @@
         <w:rPr>
           <w:rStyle w:val="VerbatimChar"/>
         </w:rPr>
-        <w:t xml:space="preserve">- A complaint on Rip Off Report</w:t>
+        <w:t xml:space="preserve">2. Specific steps she can take to remove or de-index the news articles and court images, including ready-to-use template language for key submissions (e.g. RTBF requests, publisher contact letters)</w:t>
       </w:r>
       <w:r>
         <w:br/>
@@ -168,10 +174,7 @@
         <w:rPr>
           <w:rStyle w:val="VerbatimChar"/>
         </w:rPr>
-        <w:t xml:space="preserve">- Several negative Glassdoor employee reviews</w:t>
-      </w:r>
-      <w:r>
-        <w:br/>
+        <w:t xml:space="preserve">3. A realistic timeline and what she should expect at each stage</w:t>
       </w:r>
       <w:r>
         <w:br/>
@@ -180,10 +183,7 @@
         <w:rPr>
           <w:rStyle w:val="VerbatimChar"/>
         </w:rPr>
-        <w:t xml:space="preserve">The forum posts contain factual inaccuracies and defamatory claims. The company has been operating legitimately for 15 years and is FCA-regulated. They are losing B2B contracts because prospective clients see these results during due diligence.</w:t>
-      </w:r>
-      <w:r>
-        <w:br/>
+        <w:t xml:space="preserve">4. Any legal routes available to her under UK/EU law, including regulatory complaints processes</w:t>
       </w:r>
       <w:r>
         <w:br/>
@@ -192,7 +192,7 @@
         <w:rPr>
           <w:rStyle w:val="VerbatimChar"/>
         </w:rPr>
-        <w:t xml:space="preserve">Please provide:</w:t>
+        <w:t xml:space="preserve">5. How to rebuild her personal brand alongside the removal work</w:t>
       </w:r>
       <w:r>
         <w:br/>
@@ -201,7 +201,7 @@
         <w:rPr>
           <w:rStyle w:val="VerbatimChar"/>
         </w:rPr>
-        <w:t xml:space="preserve">1. A strategy for removing or suppressing the negative forum content, including ready-to-use template language for forum removal requests and legal notices</w:t>
+        <w:t xml:space="preserve">6. An indicative budget range for the overall programme</w:t>
       </w:r>
       <w:r>
         <w:br/>
@@ -210,7 +210,10 @@
         <w:rPr>
           <w:rStyle w:val="VerbatimChar"/>
         </w:rPr>
-        <w:t xml:space="preserve">2. Specific approaches for each platform (Money Saving Expert, Consumer Action Group, Trustpilot, Rip Off Report, Glassdoor)</w:t>
+        <w:t xml:space="preserve">7. A prioritised action checklist she can hand to her team to execute immediately</w:t>
+      </w:r>
+      <w:r>
+        <w:br/>
       </w:r>
       <w:r>
         <w:br/>
@@ -219,55 +222,7 @@
         <w:rPr>
           <w:rStyle w:val="VerbatimChar"/>
         </w:rPr>
-        <w:t xml:space="preserve">3. A positive content creation plan to push down what can't be removed</w:t>
-      </w:r>
-      <w:r>
-        <w:br/>
-      </w:r>
-      <w:r>
-        <w:rPr>
-          <w:rStyle w:val="VerbatimChar"/>
-        </w:rPr>
-        <w:t xml:space="preserve">4. How to handle the review situation across platforms</w:t>
-      </w:r>
-      <w:r>
-        <w:br/>
-      </w:r>
-      <w:r>
-        <w:rPr>
-          <w:rStyle w:val="VerbatimChar"/>
-        </w:rPr>
-        <w:t xml:space="preserve">5. A realistic assessment of what can and cannot be removed</w:t>
-      </w:r>
-      <w:r>
-        <w:br/>
-      </w:r>
-      <w:r>
-        <w:rPr>
-          <w:rStyle w:val="VerbatimChar"/>
-        </w:rPr>
-        <w:t xml:space="preserve">6. An indicative budget range for the overall programme</w:t>
-      </w:r>
-      <w:r>
-        <w:br/>
-      </w:r>
-      <w:r>
-        <w:rPr>
-          <w:rStyle w:val="VerbatimChar"/>
-        </w:rPr>
-        <w:t xml:space="preserve">7. A prioritised action checklist the company can begin executing immediately</w:t>
-      </w:r>
-      <w:r>
-        <w:br/>
-      </w:r>
-      <w:r>
-        <w:br/>
-      </w:r>
-      <w:r>
-        <w:rPr>
-          <w:rStyle w:val="VerbatimChar"/>
-        </w:rPr>
-        <w:t xml:space="preserve">Where possible, reference specific legal frameworks, platform-specific procedures, or real-world examples.</w:t>
+        <w:t xml:space="preserve">Where possible, reference specific processes, legal frameworks, or real-world examples of how similar situations have been resolved.</w:t>
       </w:r>
     </w:p>
     <w:p>

</xml_diff>